<commit_message>
Allow an optional photo on every article/list item (staff, ensembles, FAQs, blog posts, etc.)
- Admin: '📷 Add a photo' button on any list item without one; optional photo upload in the blog editor
- Public: optional image/avatar slots on staff, music, engage, worship, members, announcements, FAQ cards (hide when empty)
- Fix: attach hidden file input to the DOM in the image field
- Update secretary guide (.docx) with the Add-a-photo step
</commit_message>
<xml_diff>
--- a/admin/Website-Editor-Guide.docx
+++ b/admin/Website-Editor-Guide.docx
@@ -986,6 +986,53 @@
       </w:r>
       <w:r>
         <w:t xml:space="preserve">as usual.</w:t>
+      </w:r>
+    </w:p>
+    <w:p>
+      <w:pPr>
+        <w:pStyle w:val="BodyText"/>
+      </w:pPr>
+      <w:r>
+        <w:rPr>
+          <w:b/>
+          <w:bCs/>
+        </w:rPr>
+        <w:t xml:space="preserve">Adding a photo where there isn’t one yet</w:t>
+      </w:r>
+      <w:r>
+        <w:t xml:space="preserve"> </w:t>
+      </w:r>
+      <w:r>
+        <w:t xml:space="preserve">(for example, a staff member, an event, or a blog post). Look for the</w:t>
+      </w:r>
+      <w:r>
+        <w:t xml:space="preserve"> </w:t>
+      </w:r>
+      <w:r>
+        <w:rPr>
+          <w:b/>
+          <w:bCs/>
+        </w:rPr>
+        <w:t xml:space="preserve">📷 Add a photo</w:t>
+      </w:r>
+      <w:r>
+        <w:t xml:space="preserve"> </w:t>
+      </w:r>
+      <w:r>
+        <w:t xml:space="preserve">button on that item, click it, then</w:t>
+      </w:r>
+      <w:r>
+        <w:t xml:space="preserve"> </w:t>
+      </w:r>
+      <w:r>
+        <w:rPr>
+          <w:b/>
+          <w:bCs/>
+        </w:rPr>
+        <w:t xml:space="preserve">Upload image</w:t>
+      </w:r>
+      <w:r>
+        <w:t xml:space="preserve">. The photo appears on the website automatically once you Publish. If you’d rather it stay text-only, just don’t add one — it’s always optional.</w:t>
       </w:r>
     </w:p>
     <w:p>

</xml_diff>

<commit_message>
Handover to church ownership: steward model + de-personalize all docs
- New 'Stewards' admin page (data/stewards.json) with the always-3-stewards rule + a prompt when fewer than 3
- Owner & Steward Handbook (docs/, + .docx): accounts, issuing/revoking codes, recovery/rollback, bigger-changes, domain, handover checklist
- Removed all 'call Andrew' references from admin + guide; replaced with 'a steward'/'the church office'
- Docs reference the church-owned org uuwellesleyhills/uu-wellesley-hills
</commit_message>
<xml_diff>
--- a/admin/Website-Editor-Guide.docx
+++ b/admin/Website-Editor-Guide.docx
@@ -117,7 +117,23 @@
         <w:t xml:space="preserve">The first time</w:t>
       </w:r>
       <w:r>
-        <w:t xml:space="preserve">, Andrew will sit with you and enter a one-time</w:t>
+        <w:t xml:space="preserve">, one of the website</w:t>
+      </w:r>
+      <w:r>
+        <w:t xml:space="preserve"> </w:t>
+      </w:r>
+      <w:r>
+        <w:rPr>
+          <w:b/>
+          <w:bCs/>
+        </w:rPr>
+        <w:t xml:space="preserve">stewards</w:t>
+      </w:r>
+      <w:r>
+        <w:t xml:space="preserve"> </w:t>
+      </w:r>
+      <w:r>
+        <w:t xml:space="preserve">will sit with you and enter a one-time</w:t>
       </w:r>
       <w:r>
         <w:t xml:space="preserve"> </w:t>
@@ -133,7 +149,23 @@
         <w:t xml:space="preserve"> </w:t>
       </w:r>
       <w:r>
-        <w:t xml:space="preserve">so the editor remembers you on your computer. After that, signing in is instant.</w:t>
+        <w:t xml:space="preserve">so the editor remembers you on your computer. After that, signing in is instant. (The stewards are the church volunteers who look after the website — their names are listed under</w:t>
+      </w:r>
+      <w:r>
+        <w:t xml:space="preserve"> </w:t>
+      </w:r>
+      <w:r>
+        <w:rPr>
+          <w:b/>
+          <w:bCs/>
+        </w:rPr>
+        <w:t xml:space="preserve">Stewards</w:t>
+      </w:r>
+      <w:r>
+        <w:t xml:space="preserve"> </w:t>
+      </w:r>
+      <w:r>
+        <w:t xml:space="preserve">in the editor.)</w:t>
       </w:r>
     </w:p>
     <w:p>
@@ -389,7 +421,7 @@
                 <w:i/>
                 <w:iCs/>
               </w:rPr>
-              <w:t xml:space="preserve">the code Andrew gives you</w:t>
+              <w:t xml:space="preserve">the code a steward gives you</w:t>
             </w:r>
           </w:p>
         </w:tc>
@@ -1123,7 +1155,7 @@
         <w:t xml:space="preserve"> </w:t>
       </w:r>
       <w:r>
-        <w:t xml:space="preserve">Re-enter the details from the table above. If the access code no longer works, contact Andrew for a new one.</w:t>
+        <w:t xml:space="preserve">Re-enter the details from the table above. If the access code no longer works, ask a steward for a new one.</w:t>
       </w:r>
     </w:p>
     <w:p>
@@ -1222,7 +1254,7 @@
         <w:t xml:space="preserve"> </w:t>
       </w:r>
       <w:r>
-        <w:t xml:space="preserve">groups on the left. If it’s still not there, it may be part of the fixed layout — contact Andrew.</w:t>
+        <w:t xml:space="preserve">groups on the left. If it’s still not there, it may be part of the fixed layout — ask a steward.</w:t>
       </w:r>
     </w:p>
     <w:p>
@@ -1263,7 +1295,23 @@
         <w:t xml:space="preserve"> </w:t>
       </w:r>
       <w:r>
-        <w:t xml:space="preserve">— that way you always see your change before it goes live. For anything else, reach out to Andrew or the office.</w:t>
+        <w:t xml:space="preserve">— that way you always see your change before it goes live. For anything else, reach out to one of the website</w:t>
+      </w:r>
+      <w:r>
+        <w:t xml:space="preserve"> </w:t>
+      </w:r>
+      <w:r>
+        <w:rPr>
+          <w:b/>
+          <w:bCs/>
+        </w:rPr>
+        <w:t xml:space="preserve">stewards</w:t>
+      </w:r>
+      <w:r>
+        <w:t xml:space="preserve"> </w:t>
+      </w:r>
+      <w:r>
+        <w:t xml:space="preserve">or the church office.</w:t>
       </w:r>
     </w:p>
     <w:p>

</xml_diff>

<commit_message>
Post-transfer: update editor sign-in to org 'uuwellesleyhills' (account + temp URL) in secretary guide
</commit_message>
<xml_diff>
--- a/admin/Website-Editor-Guide.docx
+++ b/admin/Website-Editor-Guide.docx
@@ -251,7 +251,7 @@
           <w:i/>
           <w:iCs/>
         </w:rPr>
-        <w:t xml:space="preserve">shudocan.github.io/uu-wellesley-hills/admin )</w:t>
+        <w:t xml:space="preserve">uuwellesleyhills.github.io/uu-wellesley-hills/admin )</w:t>
       </w:r>
     </w:p>
     <w:p>
@@ -327,7 +327,7 @@
                 <w:b/>
                 <w:bCs/>
               </w:rPr>
-              <w:t xml:space="preserve">shudocan</w:t>
+              <w:t xml:space="preserve">uuwellesleyhills</w:t>
             </w:r>
           </w:p>
         </w:tc>

</xml_diff>

<commit_message>
Move repo back to shudocan (keep old URL live); defer church-org transfer to launch. Guide sign-in reverted to shudocan.
</commit_message>
<xml_diff>
--- a/admin/Website-Editor-Guide.docx
+++ b/admin/Website-Editor-Guide.docx
@@ -251,7 +251,7 @@
           <w:i/>
           <w:iCs/>
         </w:rPr>
-        <w:t xml:space="preserve">uuwellesleyhills.github.io/uu-wellesley-hills/admin )</w:t>
+        <w:t xml:space="preserve">shudocan.github.io/uu-wellesley-hills/admin )</w:t>
       </w:r>
     </w:p>
     <w:p>
@@ -327,7 +327,7 @@
                 <w:b/>
                 <w:bCs/>
               </w:rPr>
-              <w:t xml:space="preserve">uuwellesleyhills</w:t>
+              <w:t xml:space="preserve">shudocan</w:t>
             </w:r>
           </w:p>
         </w:tc>

</xml_diff>